<commit_message>
added board header, fixed LED src and config.h
</commit_message>
<xml_diff>
--- a/documentation/reference-document.docx
+++ b/documentation/reference-document.docx
@@ -3777,7 +3777,27 @@
                   <w:szCs w:val="20"/>
                   <w:lang w:val="en-US"/>
                 </w:rPr>
-                <w:t>hardware_i2c</w:t>
+                <w:t>hardwa</w:t>
+              </w:r>
+              <w:r>
+                <w:rPr>
+                  <w:rStyle w:val="Hyperlink"/>
+                  <w:rFonts w:ascii="Roboto" w:hAnsi="Roboto" w:cs="Calibri"/>
+                  <w:sz w:val="20"/>
+                  <w:szCs w:val="20"/>
+                  <w:lang w:val="en-US"/>
+                </w:rPr>
+                <w:t>r</w:t>
+              </w:r>
+              <w:r>
+                <w:rPr>
+                  <w:rStyle w:val="Hyperlink"/>
+                  <w:rFonts w:ascii="Roboto" w:hAnsi="Roboto" w:cs="Calibri"/>
+                  <w:sz w:val="20"/>
+                  <w:szCs w:val="20"/>
+                  <w:lang w:val="en-US"/>
+                </w:rPr>
+                <w:t>e_i2c</w:t>
               </w:r>
             </w:hyperlink>
           </w:p>
@@ -4111,7 +4131,17 @@
                 <w:szCs w:val="20"/>
                 <w:lang w:val="en-US"/>
               </w:rPr>
-              <w:t>microSD</w:t>
+              <w:t>M</w:t>
+            </w:r>
+            <w:r>
+              <w:rPr>
+                <w:rFonts w:ascii="Roboto" w:hAnsi="Roboto" w:cs="Calibri"/>
+                <w:color w:val="000000" w:themeColor="text1"/>
+                <w:sz w:val="20"/>
+                <w:szCs w:val="20"/>
+                <w:lang w:val="en-US"/>
+              </w:rPr>
+              <w:t>icroSD</w:t>
             </w:r>
           </w:p>
         </w:tc>
@@ -4703,7 +4733,27 @@
                   <w:szCs w:val="20"/>
                   <w:lang w:val="en-US"/>
                 </w:rPr>
-                <w:t>hardware_gpio</w:t>
+                <w:t>hardware</w:t>
+              </w:r>
+              <w:r>
+                <w:rPr>
+                  <w:rStyle w:val="Hyperlink"/>
+                  <w:rFonts w:ascii="Roboto" w:hAnsi="Roboto" w:cs="Calibri"/>
+                  <w:sz w:val="20"/>
+                  <w:szCs w:val="20"/>
+                  <w:lang w:val="en-US"/>
+                </w:rPr>
+                <w:t>_</w:t>
+              </w:r>
+              <w:r>
+                <w:rPr>
+                  <w:rStyle w:val="Hyperlink"/>
+                  <w:rFonts w:ascii="Roboto" w:hAnsi="Roboto" w:cs="Calibri"/>
+                  <w:sz w:val="20"/>
+                  <w:szCs w:val="20"/>
+                  <w:lang w:val="en-US"/>
+                </w:rPr>
+                <w:t>gpio</w:t>
               </w:r>
             </w:hyperlink>
           </w:p>
@@ -5043,7 +5093,17 @@
                 <w:szCs w:val="20"/>
                 <w:lang w:val="en-US"/>
               </w:rPr>
-              <w:t>USB 1.1</w:t>
+              <w:t>USB 1</w:t>
+            </w:r>
+            <w:r>
+              <w:rPr>
+                <w:rFonts w:ascii="Roboto" w:hAnsi="Roboto" w:cs="Calibri"/>
+                <w:color w:val="000000" w:themeColor="text1"/>
+                <w:sz w:val="20"/>
+                <w:szCs w:val="20"/>
+                <w:lang w:val="en-US"/>
+              </w:rPr>
+              <w:t xml:space="preserve"> HS</w:t>
             </w:r>
           </w:p>
         </w:tc>
@@ -5069,7 +5129,7 @@
                 <w:szCs w:val="20"/>
                 <w:lang w:val="en-US"/>
               </w:rPr>
-              <w:t>D+ - USB_DP / PIN67</w:t>
+              <w:t>D+ USB_DP / PIN67</w:t>
             </w:r>
           </w:p>
           <w:p>
@@ -5089,7 +5149,7 @@
                 <w:szCs w:val="20"/>
                 <w:lang w:val="en-US"/>
               </w:rPr>
-              <w:t>D- - USB_DM / PIN66</w:t>
+              <w:t>D-  USB_DM / PIN66</w:t>
             </w:r>
           </w:p>
         </w:tc>
@@ -6087,6 +6147,18 @@
       <w:shd w:val="clear" w:color="auto" w:fill="E1DFDD"/>
     </w:rPr>
   </w:style>
+  <w:style w:type="character" w:styleId="FollowedHyperlink">
+    <w:name w:val="FollowedHyperlink"/>
+    <w:basedOn w:val="DefaultParagraphFont"/>
+    <w:uiPriority w:val="99"/>
+    <w:semiHidden/>
+    <w:unhideWhenUsed/>
+    <w:rsid w:val="00EE35FD"/>
+    <w:rPr>
+      <w:color w:val="96607D" w:themeColor="followedHyperlink"/>
+      <w:u w:val="single"/>
+    </w:rPr>
+  </w:style>
 </w:styles>
 </file>
 

</xml_diff>